<commit_message>
fix: Política de Controle Tecnológico - Anexo 1 passa a R01 (linha de pista) e cópias R00 obsoletas saem do site
Co-Authored-By: Claude Fable 5.1 <noreply@anthropic.com>
</commit_message>
<xml_diff>
--- a/politica-controle-tecnologico/arquivos/Anexo_2_Nao_Conformidade_Pontos_Parada_R00.docx
+++ b/politica-controle-tecnologico/arquivos/Anexo_2_Nao_Conformidade_Pontos_Parada_R00.docx
@@ -2880,7 +2880,7 @@
         <w:noProof/>
       </w:rPr>
       <w:drawing>
-        <wp:inline distT="0" distB="0" distL="0" distR="0" wp14:anchorId="6314CD66" wp14:editId="3018A915">
+        <wp:inline distT="0" distB="0" distL="0" distR="0" wp14:anchorId="77BC9F97" wp14:editId="1A435CA4">
           <wp:extent cx="1872000" cy="501930"/>
           <wp:effectExtent l="0" t="0" r="0" b="0"/>
           <wp:docPr id="1" name="Picture 1"/>
@@ -3092,31 +3092,31 @@
       </w:rPr>
     </w:lvl>
   </w:abstractNum>
-  <w:num w:numId="1" w16cid:durableId="1152984903">
+  <w:num w:numId="1" w16cid:durableId="2107648380">
     <w:abstractNumId w:val="8"/>
   </w:num>
-  <w:num w:numId="2" w16cid:durableId="1887836723">
+  <w:num w:numId="2" w16cid:durableId="1788699849">
     <w:abstractNumId w:val="6"/>
   </w:num>
-  <w:num w:numId="3" w16cid:durableId="2097283984">
+  <w:num w:numId="3" w16cid:durableId="2006929314">
     <w:abstractNumId w:val="5"/>
   </w:num>
-  <w:num w:numId="4" w16cid:durableId="305746747">
+  <w:num w:numId="4" w16cid:durableId="77022490">
     <w:abstractNumId w:val="4"/>
   </w:num>
-  <w:num w:numId="5" w16cid:durableId="941301402">
+  <w:num w:numId="5" w16cid:durableId="1438065005">
     <w:abstractNumId w:val="7"/>
   </w:num>
-  <w:num w:numId="6" w16cid:durableId="1564414480">
+  <w:num w:numId="6" w16cid:durableId="200021634">
     <w:abstractNumId w:val="3"/>
   </w:num>
-  <w:num w:numId="7" w16cid:durableId="362218279">
+  <w:num w:numId="7" w16cid:durableId="1466655957">
     <w:abstractNumId w:val="2"/>
   </w:num>
-  <w:num w:numId="8" w16cid:durableId="2129203255">
+  <w:num w:numId="8" w16cid:durableId="423385569">
     <w:abstractNumId w:val="1"/>
   </w:num>
-  <w:num w:numId="9" w16cid:durableId="959796563">
+  <w:num w:numId="9" w16cid:durableId="1352603606">
     <w:abstractNumId w:val="0"/>
   </w:num>
 </w:numbering>

</xml_diff>

<commit_message>
fix: data de aprovação 21/10/2026 nos Anexos 2, 3 e 4 da Política R03
Co-Authored-By: Claude Fable 5.1 <noreply@anthropic.com>
</commit_message>
<xml_diff>
--- a/politica-controle-tecnologico/arquivos/Anexo_2_Nao_Conformidade_Pontos_Parada_R00.docx
+++ b/politica-controle-tecnologico/arquivos/Anexo_2_Nao_Conformidade_Pontos_Parada_R00.docx
@@ -271,7 +271,7 @@
               <w:rPr>
                 <w:sz w:val="19"/>
               </w:rPr>
-              <w:t>Assinatura/data: aprovado em 17/10/2026</w:t>
+              <w:t>Assinatura/data: aprovado em 21/10/2026</w:t>
             </w:r>
           </w:p>
         </w:tc>
@@ -296,7 +296,7 @@
               <w:rPr>
                 <w:sz w:val="19"/>
               </w:rPr>
-              <w:t>Assinatura/data: aprovado em 17/10/2026</w:t>
+              <w:t>Assinatura/data: aprovado em 21/10/2026</w:t>
             </w:r>
           </w:p>
         </w:tc>
@@ -2874,7 +2874,7 @@
         <w:noProof/>
       </w:rPr>
       <w:drawing>
-        <wp:inline distT="0" distB="0" distL="0" distR="0" wp14:anchorId="308A60C1" wp14:editId="47AE8FD9">
+        <wp:inline distT="0" distB="0" distL="0" distR="0" wp14:anchorId="44D1907F" wp14:editId="36A11F52">
           <wp:extent cx="1872000" cy="501930"/>
           <wp:effectExtent l="0" t="0" r="0" b="0"/>
           <wp:docPr id="1" name="Picture 1"/>
@@ -3086,31 +3086,31 @@
       </w:rPr>
     </w:lvl>
   </w:abstractNum>
-  <w:num w:numId="1" w16cid:durableId="1878618632">
+  <w:num w:numId="1" w16cid:durableId="1318727079">
     <w:abstractNumId w:val="8"/>
   </w:num>
-  <w:num w:numId="2" w16cid:durableId="1480802235">
+  <w:num w:numId="2" w16cid:durableId="347677343">
     <w:abstractNumId w:val="6"/>
   </w:num>
-  <w:num w:numId="3" w16cid:durableId="507603678">
+  <w:num w:numId="3" w16cid:durableId="717633760">
     <w:abstractNumId w:val="5"/>
   </w:num>
-  <w:num w:numId="4" w16cid:durableId="2038655273">
+  <w:num w:numId="4" w16cid:durableId="851726710">
     <w:abstractNumId w:val="4"/>
   </w:num>
-  <w:num w:numId="5" w16cid:durableId="2126801613">
+  <w:num w:numId="5" w16cid:durableId="208692607">
     <w:abstractNumId w:val="7"/>
   </w:num>
-  <w:num w:numId="6" w16cid:durableId="747768609">
+  <w:num w:numId="6" w16cid:durableId="1101267927">
     <w:abstractNumId w:val="3"/>
   </w:num>
-  <w:num w:numId="7" w16cid:durableId="1882132245">
+  <w:num w:numId="7" w16cid:durableId="1331713926">
     <w:abstractNumId w:val="2"/>
   </w:num>
-  <w:num w:numId="8" w16cid:durableId="96414435">
+  <w:num w:numId="8" w16cid:durableId="1137139271">
     <w:abstractNumId w:val="1"/>
   </w:num>
-  <w:num w:numId="9" w16cid:durableId="413358532">
+  <w:num w:numId="9" w16cid:durableId="1382054992">
     <w:abstractNumId w:val="0"/>
   </w:num>
 </w:numbering>

</xml_diff>